<commit_message>
Changed rainbow mode implementation, to fit the Pymol approach
</commit_message>
<xml_diff>
--- a/docs/Details.docx
+++ b/docs/Details.docx
@@ -1204,7 +1204,7 @@
         <w:spacing w:after="140"/>
       </w:pPr>
       <w:r>
-        <w:t xml:space="preserve">render_espVMD.py therefore renders in passes and keeps whatever each pass produced: full quality first, then the missing views as an OpenGL window capture — no recursion, transparency preserved, slightly less fine — and only then as an opaque surface. Which pass produced which view is recorded per view in *_settings.txt and in the views column of summary.csv, because a figure made a different way must not look like the others in the record. The window capture is the one pass that needs a visible window, which is why --headless defers it rather than removing it.</w:t>
+        <w:t xml:space="preserve">render_espVMD.py therefore renders in passes and keeps whatever each pass produced: full quality first, then the missing views as an OpenGL window capture — no recursion, transparency preserved, slightly less fine — and only then as an opaque surface. Which pass produced which view is recorded per view in *_settings.txt and in the views column of summary.csv, because a figure made a different way must not look like the others in the record. The window capture copies the OpenGL buffer, so the VMD window has to be on screen and uncovered while it runs.</w:t>
       </w:r>
     </w:p>
     <w:p>
@@ -1656,7 +1656,7 @@
                 <w:sz w:val="19"/>
                 <w:szCs w:val="19"/>
               </w:rPr>
-              <w:t xml:space="preserve">TachyonInternal renders at window size, and Windows clamps the window to the screen. On a 1061-pixel-tall screen a request for 1280 yields 1061. Without a window (--headless) the size comes from -size and the cap disappears.</w:t>
+              <w:t xml:space="preserve">TachyonInternal renders at window size, and Windows clamps the window to the screen. On a 1061-pixel-tall screen a request for 1280 yields 1061 — the images are then shorter than --res asked for.</w:t>
             </w:r>
           </w:p>
         </w:tc>

</xml_diff>

<commit_message>
Implemented --stick-size option, including the information in the readme, implemented a new script in order to calculated the Potentials in the sigma holes via trillinear interpolation!
</commit_message>
<xml_diff>
--- a/docs/Details.docx
+++ b/docs/Details.docx
@@ -750,7 +750,31 @@
         <w:spacing w:after="140"/>
       </w:pPr>
       <w:r>
-        <w:t xml:space="preserve">The values come from grid points near the shell, not from an interpolated surface, and no σ-hole is located. That is the deliberate cut: locating the σ-hole maximum needs trilinear interpolation onto the isosurface, and that code is already written, parameter-studied and documented in the PyMOL project. A second implementation here would be a duplicate nobody notices drifting until two chapters of the same thesis quote different numbers for the same molecule. Quote the PyMOL numbers; the ones here size a colour bar.</w:t>
+        <w:t>The values come from grid points near the shell, not from an interpolated surface, and the rendering workflow locates no σ-hole. That cut still holds: run_allVMD.py needs a colour scale and nothing more, while locating the σ-hole maximum needs trilinear interpolation onto the isosurface — slower, and an answer to a question the picture does not ask.</w:t>
+      </w:r>
+    </w:p>
+    <w:p>
+      <w:pPr>
+        <w:spacing w:after="140"/>
+      </w:pPr>
+      <w:r>
+        <w:t>The measurement is available in the repository all the same, but outside that workflow: tools/SigmaHoleCalc.py reads the finished cubes and reports the σ-hole per halogen, the ray-based and the point-based value side by side. Nothing in the image pipeline calls it, so a broken σ-hole can never cost an image set.</w:t>
+      </w:r>
+    </w:p>
+    <w:p>
+      <w:pPr>
+        <w:spacing w:after="140"/>
+      </w:pPr>
+      <w:r>
+        <w:t>The objection to a second implementation of one numerical procedure is that nobody notices it drifting until two chapters of the same thesis quote different numbers for the same molecule. The script therefore pins itself: run without arguments it measures reference/brombenzol and compares against the value the PyMOL pipeline obtains on the same cubes, and it fails if the two differ by more than 5e-5 a.u. They currently agree to eight decimals on every molecule in results/ — bromobenzene +0.01528 a.u. on the reference grid, iodobenzene +0.02559, and Halcion's two chlorines +0.01709 and +0.01440, the folded case that produced the original error.</w:t>
+      </w:r>
+    </w:p>
+    <w:p>
+      <w:pPr>
+        <w:spacing w:after="140"/>
+      </w:pPr>
+      <w:r>
+        <w:t>That agreement is not an independent confirmation, and should not be presented as one. SigmaHoleCalc.py is a port of the PyMOL routine, not a second derivation: it tests that the two copies are still the same code, not that the method is right. The mutual control section 1 claims for the two viewers does not extend to it.</w:t>
       </w:r>
     </w:p>
     <w:p>
@@ -1749,6 +1773,96 @@
     </w:p>
     <w:p>
       <w:pPr>
+        <w:pStyle w:val="Heading2"/>
+        <w:spacing w:after="120" w:before="260"/>
+      </w:pPr>
+      <w:r>
+        <w:t>The structure file is checked before anything is rendered</w:t>
+      </w:r>
+    </w:p>
+    <w:p>
+      <w:pPr>
+        <w:spacing w:after="140"/>
+      </w:pPr>
+      <w:r>
+        <w:t>Nothing in the cube format forces the atom block and the grid to describe the same geometry. The atoms come from the structure file, the grid from the quantum chemistry, and when the two disagree the molecule floats beside its own isosurface. This is not a failure that announces itself: there is a round, coloured surface in every direction, and one takes the far side for the σ-hole. It surfaced on Halcion, where a leftover .mol from an earlier run put all 35 nuclei in vacuum. The centroids of both geometries agreed and no axis permutation repaired it, so the difference was a rotation — the one error a glance at the picture will not catch.</w:t>
+      </w:r>
+    </w:p>
+    <w:p>
+      <w:pPr>
+        <w:spacing w:after="140"/>
+      </w:pPr>
+      <w:r>
+        <w:t>check_alignment looks up the electron density at every heavy nucleus and takes the median of the largest value in the 3×3×3 neighbourhood of each. Where a nucleus sits the density is enormous — 28793 at the bromine of bromobenzene, about 60 at a carbon on a fine grid — and where none sits it is near zero. Measured across the molecules of this project, healthy medians are 64, 27 and 5 for grid spacings of 0.12, 0.25 and 0.60 Bohr; the broken case gave 0.03. NUCLEI_RHO_MIN is 1.0, a factor of five below the coarsest healthy case and thirty above the broken one, with nothing in between that could be mistaken for the other.</w:t>
+      </w:r>
+    </w:p>
+    <w:p>
+      <w:pPr>
+        <w:spacing w:after="140"/>
+      </w:pPr>
+      <w:r>
+        <w:t>Two details are not obvious. The median rather than the minimum, because iodine is described by an effective core potential and carries about 0.26 at its nucleus on a perfectly healthy molecule — less than a hydrogen; a minimum would reject every iodine compound. And the largest value in the neighbourhood rather than trilinear interpolation, because the density has a cusp at a nucleus and linear interpolation can only cut a cusp off — measured at 46 % too low on the coarse grid. The cheaper test, whether all atoms lie inside the grid box at all, would have been useless: of 2000 random rotations of Halcion, not one pushed an atom out of the box.</w:t>
+      </w:r>
+    </w:p>
+    <w:p>
+      <w:pPr>
+        <w:spacing w:after="140"/>
+      </w:pPr>
+      <w:r>
+        <w:t>The test sits in ensure_cubes, at the moment the structure file and the grid are married, and it runs before a single cube is written. That is the right place for this pipeline because VMD builds the molecule from the cube header — once the cube exists, the structure file no longer influences the picture. The PyMOL project checks the structure file itself, at render time, because PyMOL draws the sticks from it. Each project tests the geometry its own viewer actually draws.</w:t>
+      </w:r>
+    </w:p>
+    <w:p>
+      <w:pPr>
+        <w:pStyle w:val="Heading2"/>
+        <w:spacing w:after="120" w:before="260"/>
+      </w:pPr>
+      <w:r>
+        <w:t>One unusable molecule does not cost the others their run</w:t>
+      </w:r>
+    </w:p>
+    <w:p>
+      <w:pPr>
+        <w:spacing w:after="140"/>
+      </w:pPr>
+      <w:r>
+        <w:t>Two things can go wrong before a molecule is rendered, and they are answered differently. If find_structure sees more than one structure file that is not simply the same geometry in a second format, the whole run stops. It would otherwise take the first in sort order, and a stale leftover that happens to sort first pairs the wrong geometry with the grids without saying so — "Halcion - Kopie.mol" next to "Halcion.mol" is enough. The script cannot know which one is meant, so it names every candidate it found and asks for the folder to be cleaned up.</w:t>
+      </w:r>
+    </w:p>
+    <w:p>
+      <w:pPr>
+        <w:spacing w:after="140"/>
+      </w:pPr>
+      <w:r>
+        <w:t>A mismatch caught by check_alignment is local to one folder, and is treated that way. At several minutes per molecule, losing an eight-molecule run to one bad folder would be waste. The molecule is skipped before any cube is written, it is named again at the end of the run, and main returns 1 instead of 0 — visible to whatever called the script, without the other seven image sets being lost. If every molecule is skipped the run stops with "No molecule could be processed."</w:t>
+      </w:r>
+    </w:p>
+    <w:p>
+      <w:pPr>
+        <w:spacing w:after="0" w:before="40"/>
+        <w:ind w:left="360"/>
+      </w:pPr>
+      <w:r>
+        <w:rPr>
+          <w:rFonts w:ascii="Consolas" w:cs="Consolas" w:eastAsia="Consolas" w:hAnsi="Consolas"/>
+          <w:sz w:val="18"/>
+          <w:szCs w:val="18"/>
+        </w:rPr>
+        <w:t>[Test]</w:t>
+        <w:br/>
+        <w:t xml:space="preserve">    ! Test: structure and grid do not match. The median electron</w:t>
+        <w:br/>
+        <w:t xml:space="preserve">      density at the heavy nuclei is 0.056, expected &gt; 1 ...</w:t>
+        <w:br/>
+        <w:t xml:space="preserve">    ! Test skipped - no scene and no images written.</w:t>
+        <w:br/>
+        <w:t>...</w:t>
+        <w:br/>
+        <w:t>! skipped, structure and grid do not match: Test</w:t>
+      </w:r>
+    </w:p>
+    <w:p>
+      <w:pPr>
         <w:pStyle w:val="Heading1"/>
         <w:spacing w:after="160" w:before="320"/>
       </w:pPr>
@@ -2396,7 +2510,59 @@
                 <w:sz w:val="19"/>
                 <w:szCs w:val="19"/>
               </w:rPr>
-              <w:t xml:space="preserve">open</w:t>
+              <w:t>done</w:t>
+            </w:r>
+          </w:p>
+        </w:tc>
+      </w:tr>
+      <w:tr>
+        <w:tc>
+          <w:tcPr>
+            <w:tcW w:type="dxa" w:w="3100"/>
+            <w:tcMar>
+              <w:top w:type="dxa" w:w="60"/>
+              <w:left w:type="dxa" w:w="90"/>
+              <w:bottom w:type="dxa" w:w="60"/>
+              <w:right w:type="dxa" w:w="90"/>
+            </w:tcMar>
+          </w:tcPr>
+          <w:p>
+            <w:pPr>
+              <w:spacing w:after="0"/>
+            </w:pPr>
+            <w:r>
+              <w:rPr>
+                <w:b w:val="false"/>
+                <w:bCs w:val="false"/>
+                <w:sz w:val="19"/>
+                <w:szCs w:val="19"/>
+              </w:rPr>
+              <w:t>tools/SigmaHoleCalc.py — σ-hole by ray marching, pinned to the PyMOL value</w:t>
+            </w:r>
+          </w:p>
+        </w:tc>
+        <w:tc>
+          <w:tcPr>
+            <w:tcW w:type="dxa" w:w="6260"/>
+            <w:tcMar>
+              <w:top w:type="dxa" w:w="60"/>
+              <w:left w:type="dxa" w:w="90"/>
+              <w:bottom w:type="dxa" w:w="60"/>
+              <w:right w:type="dxa" w:w="90"/>
+            </w:tcMar>
+          </w:tcPr>
+          <w:p>
+            <w:pPr>
+              <w:spacing w:after="0"/>
+            </w:pPr>
+            <w:r>
+              <w:rPr>
+                <w:b w:val="false"/>
+                <w:bCs w:val="false"/>
+                <w:sz w:val="19"/>
+                <w:szCs w:val="19"/>
+              </w:rPr>
+              <w:t>done</w:t>
             </w:r>
           </w:p>
         </w:tc>

</xml_diff>